<commit_message>
changed styling of bug report
</commit_message>
<xml_diff>
--- a/bug_reports/Bug_reports.docx
+++ b/bug_reports/Bug_reports.docx
@@ -6,11 +6,15 @@
       <w:pPr>
         <w:rPr>
           <w:rFonts w:ascii="Calibri" w:hAnsi="Calibri" w:cs="Calibri"/>
+          <w:b/>
+          <w:bCs/>
         </w:rPr>
       </w:pPr>
       <w:r>
         <w:rPr>
           <w:rFonts w:ascii="Calibri" w:hAnsi="Calibri" w:cs="Calibri"/>
+          <w:b/>
+          <w:bCs/>
         </w:rPr>
         <w:t>BUG_01 – Inconsistent validation styling</w:t>
       </w:r>
@@ -24,8 +28,16 @@
       <w:r>
         <w:rPr>
           <w:rFonts w:ascii="Calibri" w:hAnsi="Calibri" w:cs="Calibri"/>
-        </w:rPr>
-        <w:t>Low</w:t>
+          <w:b/>
+          <w:bCs/>
+        </w:rPr>
+        <w:t>Affected Test Cases:</w:t>
+      </w:r>
+      <w:r>
+        <w:rPr>
+          <w:rFonts w:ascii="Calibri" w:hAnsi="Calibri" w:cs="Calibri"/>
+        </w:rPr>
+        <w:t xml:space="preserve"> TC_02, TC_03</w:t>
       </w:r>
     </w:p>
     <w:p>
@@ -37,8 +49,114 @@
       <w:r>
         <w:rPr>
           <w:rFonts w:ascii="Calibri" w:hAnsi="Calibri" w:cs="Calibri"/>
-        </w:rPr>
-        <w:t>Affected Test Cases: TC_02, TC_03</w:t>
+          <w:b/>
+          <w:bCs/>
+        </w:rPr>
+        <w:t>Expected Result:</w:t>
+      </w:r>
+      <w:r>
+        <w:rPr>
+          <w:rFonts w:ascii="Calibri" w:hAnsi="Calibri" w:cs="Calibri"/>
+        </w:rPr>
+        <w:t xml:space="preserve"> </w:t>
+      </w:r>
+      <w:proofErr w:type="spellStart"/>
+      <w:r>
+        <w:rPr>
+          <w:rFonts w:ascii="Calibri" w:hAnsi="Calibri" w:cs="Calibri"/>
+        </w:rPr>
+        <w:t>Neplatné</w:t>
+      </w:r>
+      <w:proofErr w:type="spellEnd"/>
+      <w:r>
+        <w:rPr>
+          <w:rFonts w:ascii="Calibri" w:hAnsi="Calibri" w:cs="Calibri"/>
+        </w:rPr>
+        <w:t xml:space="preserve"> </w:t>
+      </w:r>
+      <w:proofErr w:type="spellStart"/>
+      <w:r>
+        <w:rPr>
+          <w:rFonts w:ascii="Calibri" w:hAnsi="Calibri" w:cs="Calibri"/>
+        </w:rPr>
+        <w:t>polia</w:t>
+      </w:r>
+      <w:proofErr w:type="spellEnd"/>
+      <w:r>
+        <w:rPr>
+          <w:rFonts w:ascii="Calibri" w:hAnsi="Calibri" w:cs="Calibri"/>
+        </w:rPr>
+        <w:t xml:space="preserve"> Meno, Email a </w:t>
+      </w:r>
+      <w:proofErr w:type="spellStart"/>
+      <w:r>
+        <w:rPr>
+          <w:rFonts w:ascii="Calibri" w:hAnsi="Calibri" w:cs="Calibri"/>
+        </w:rPr>
+        <w:t>Správa</w:t>
+      </w:r>
+      <w:proofErr w:type="spellEnd"/>
+      <w:r>
+        <w:rPr>
+          <w:rFonts w:ascii="Calibri" w:hAnsi="Calibri" w:cs="Calibri"/>
+        </w:rPr>
+        <w:t xml:space="preserve"> </w:t>
+      </w:r>
+      <w:proofErr w:type="spellStart"/>
+      <w:r>
+        <w:rPr>
+          <w:rFonts w:ascii="Calibri" w:hAnsi="Calibri" w:cs="Calibri"/>
+        </w:rPr>
+        <w:t>majú</w:t>
+      </w:r>
+      <w:proofErr w:type="spellEnd"/>
+      <w:r>
+        <w:rPr>
+          <w:rFonts w:ascii="Calibri" w:hAnsi="Calibri" w:cs="Calibri"/>
+        </w:rPr>
+        <w:t xml:space="preserve"> </w:t>
+      </w:r>
+      <w:proofErr w:type="spellStart"/>
+      <w:r>
+        <w:rPr>
+          <w:rFonts w:ascii="Calibri" w:hAnsi="Calibri" w:cs="Calibri"/>
+        </w:rPr>
+        <w:t>jednotné</w:t>
+      </w:r>
+      <w:proofErr w:type="spellEnd"/>
+      <w:r>
+        <w:rPr>
+          <w:rFonts w:ascii="Calibri" w:hAnsi="Calibri" w:cs="Calibri"/>
+        </w:rPr>
+        <w:t xml:space="preserve"> </w:t>
+      </w:r>
+      <w:proofErr w:type="spellStart"/>
+      <w:r>
+        <w:rPr>
+          <w:rFonts w:ascii="Calibri" w:hAnsi="Calibri" w:cs="Calibri"/>
+        </w:rPr>
+        <w:t>vizuálne</w:t>
+      </w:r>
+      <w:proofErr w:type="spellEnd"/>
+      <w:r>
+        <w:rPr>
+          <w:rFonts w:ascii="Calibri" w:hAnsi="Calibri" w:cs="Calibri"/>
+        </w:rPr>
+        <w:t xml:space="preserve"> </w:t>
+      </w:r>
+      <w:proofErr w:type="spellStart"/>
+      <w:r>
+        <w:rPr>
+          <w:rFonts w:ascii="Calibri" w:hAnsi="Calibri" w:cs="Calibri"/>
+        </w:rPr>
+        <w:t>označenie</w:t>
+      </w:r>
+      <w:proofErr w:type="spellEnd"/>
+      <w:r>
+        <w:rPr>
+          <w:rFonts w:ascii="Calibri" w:hAnsi="Calibri" w:cs="Calibri"/>
+        </w:rPr>
+        <w:t>.</w:t>
       </w:r>
     </w:p>
     <w:p>
@@ -50,15 +168,23 @@
       <w:r>
         <w:rPr>
           <w:rFonts w:ascii="Calibri" w:hAnsi="Calibri" w:cs="Calibri"/>
-        </w:rPr>
-        <w:t xml:space="preserve">Expected Result: </w:t>
+          <w:b/>
+          <w:bCs/>
+        </w:rPr>
+        <w:t>Actual Result:</w:t>
+      </w:r>
+      <w:r>
+        <w:rPr>
+          <w:rFonts w:ascii="Calibri" w:hAnsi="Calibri" w:cs="Calibri"/>
+        </w:rPr>
+        <w:t xml:space="preserve"> Pole </w:t>
       </w:r>
       <w:proofErr w:type="spellStart"/>
       <w:r>
         <w:rPr>
           <w:rFonts w:ascii="Calibri" w:hAnsi="Calibri" w:cs="Calibri"/>
         </w:rPr>
-        <w:t>Neplatné</w:t>
+        <w:t>Správa</w:t>
       </w:r>
       <w:proofErr w:type="spellEnd"/>
       <w:r>
@@ -72,21 +198,21 @@
         <w:rPr>
           <w:rFonts w:ascii="Calibri" w:hAnsi="Calibri" w:cs="Calibri"/>
         </w:rPr>
-        <w:t>polia</w:t>
+        <w:t>má</w:t>
       </w:r>
       <w:proofErr w:type="spellEnd"/>
       <w:r>
         <w:rPr>
           <w:rFonts w:ascii="Calibri" w:hAnsi="Calibri" w:cs="Calibri"/>
         </w:rPr>
-        <w:t xml:space="preserve"> Meno, Email a </w:t>
+        <w:t xml:space="preserve"> </w:t>
       </w:r>
       <w:proofErr w:type="spellStart"/>
       <w:r>
         <w:rPr>
           <w:rFonts w:ascii="Calibri" w:hAnsi="Calibri" w:cs="Calibri"/>
         </w:rPr>
-        <w:t>Správa</w:t>
+        <w:t>červený</w:t>
       </w:r>
       <w:proofErr w:type="spellEnd"/>
       <w:r>
@@ -100,13 +226,27 @@
         <w:rPr>
           <w:rFonts w:ascii="Calibri" w:hAnsi="Calibri" w:cs="Calibri"/>
         </w:rPr>
-        <w:t>majú</w:t>
+        <w:t>rámček</w:t>
       </w:r>
       <w:proofErr w:type="spellEnd"/>
       <w:r>
         <w:rPr>
           <w:rFonts w:ascii="Calibri" w:hAnsi="Calibri" w:cs="Calibri"/>
         </w:rPr>
+        <w:t xml:space="preserve">, </w:t>
+      </w:r>
+      <w:proofErr w:type="spellStart"/>
+      <w:r>
+        <w:rPr>
+          <w:rFonts w:ascii="Calibri" w:hAnsi="Calibri" w:cs="Calibri"/>
+        </w:rPr>
+        <w:t>zatiaľ</w:t>
+      </w:r>
+      <w:proofErr w:type="spellEnd"/>
+      <w:r>
+        <w:rPr>
+          <w:rFonts w:ascii="Calibri" w:hAnsi="Calibri" w:cs="Calibri"/>
+        </w:rPr>
         <w:t xml:space="preserve"> </w:t>
       </w:r>
       <w:proofErr w:type="spellStart"/>
@@ -114,13 +254,41 @@
         <w:rPr>
           <w:rFonts w:ascii="Calibri" w:hAnsi="Calibri" w:cs="Calibri"/>
         </w:rPr>
-        <w:t>jednotné</w:t>
+        <w:t>čo</w:t>
       </w:r>
       <w:proofErr w:type="spellEnd"/>
       <w:r>
         <w:rPr>
           <w:rFonts w:ascii="Calibri" w:hAnsi="Calibri" w:cs="Calibri"/>
         </w:rPr>
+        <w:t xml:space="preserve"> Meno </w:t>
+      </w:r>
+      <w:proofErr w:type="spellStart"/>
+      <w:r>
+        <w:rPr>
+          <w:rFonts w:ascii="Calibri" w:hAnsi="Calibri" w:cs="Calibri"/>
+        </w:rPr>
+        <w:t>a</w:t>
+      </w:r>
+      <w:proofErr w:type="spellEnd"/>
+      <w:r>
+        <w:rPr>
+          <w:rFonts w:ascii="Calibri" w:hAnsi="Calibri" w:cs="Calibri"/>
+        </w:rPr>
+        <w:t xml:space="preserve"> Email </w:t>
+      </w:r>
+      <w:proofErr w:type="spellStart"/>
+      <w:r>
+        <w:rPr>
+          <w:rFonts w:ascii="Calibri" w:hAnsi="Calibri" w:cs="Calibri"/>
+        </w:rPr>
+        <w:t>používajú</w:t>
+      </w:r>
+      <w:proofErr w:type="spellEnd"/>
+      <w:r>
+        <w:rPr>
+          <w:rFonts w:ascii="Calibri" w:hAnsi="Calibri" w:cs="Calibri"/>
+        </w:rPr>
         <w:t xml:space="preserve"> </w:t>
       </w:r>
       <w:proofErr w:type="spellStart"/>
@@ -128,7 +296,7 @@
         <w:rPr>
           <w:rFonts w:ascii="Calibri" w:hAnsi="Calibri" w:cs="Calibri"/>
         </w:rPr>
-        <w:t>vizuálne</w:t>
+        <w:t>odlišné</w:t>
       </w:r>
       <w:proofErr w:type="spellEnd"/>
       <w:r>
@@ -142,7 +310,7 @@
         <w:rPr>
           <w:rFonts w:ascii="Calibri" w:hAnsi="Calibri" w:cs="Calibri"/>
         </w:rPr>
-        <w:t>označenie</w:t>
+        <w:t>ohraničenie</w:t>
       </w:r>
       <w:proofErr w:type="spellEnd"/>
       <w:r>
@@ -161,148 +329,16 @@
       <w:r>
         <w:rPr>
           <w:rFonts w:ascii="Calibri" w:hAnsi="Calibri" w:cs="Calibri"/>
-        </w:rPr>
-        <w:t xml:space="preserve">Actual Result: Pole </w:t>
-      </w:r>
-      <w:proofErr w:type="spellStart"/>
-      <w:r>
-        <w:rPr>
-          <w:rFonts w:ascii="Calibri" w:hAnsi="Calibri" w:cs="Calibri"/>
-        </w:rPr>
-        <w:t>Správa</w:t>
-      </w:r>
-      <w:proofErr w:type="spellEnd"/>
-      <w:r>
-        <w:rPr>
-          <w:rFonts w:ascii="Calibri" w:hAnsi="Calibri" w:cs="Calibri"/>
-        </w:rPr>
-        <w:t xml:space="preserve"> </w:t>
-      </w:r>
-      <w:proofErr w:type="spellStart"/>
-      <w:r>
-        <w:rPr>
-          <w:rFonts w:ascii="Calibri" w:hAnsi="Calibri" w:cs="Calibri"/>
-        </w:rPr>
-        <w:t>má</w:t>
-      </w:r>
-      <w:proofErr w:type="spellEnd"/>
-      <w:r>
-        <w:rPr>
-          <w:rFonts w:ascii="Calibri" w:hAnsi="Calibri" w:cs="Calibri"/>
-        </w:rPr>
-        <w:t xml:space="preserve"> </w:t>
-      </w:r>
-      <w:proofErr w:type="spellStart"/>
-      <w:r>
-        <w:rPr>
-          <w:rFonts w:ascii="Calibri" w:hAnsi="Calibri" w:cs="Calibri"/>
-        </w:rPr>
-        <w:t>červený</w:t>
-      </w:r>
-      <w:proofErr w:type="spellEnd"/>
-      <w:r>
-        <w:rPr>
-          <w:rFonts w:ascii="Calibri" w:hAnsi="Calibri" w:cs="Calibri"/>
-        </w:rPr>
-        <w:t xml:space="preserve"> </w:t>
-      </w:r>
-      <w:proofErr w:type="spellStart"/>
-      <w:r>
-        <w:rPr>
-          <w:rFonts w:ascii="Calibri" w:hAnsi="Calibri" w:cs="Calibri"/>
-        </w:rPr>
-        <w:t>rámček</w:t>
-      </w:r>
-      <w:proofErr w:type="spellEnd"/>
-      <w:r>
-        <w:rPr>
-          <w:rFonts w:ascii="Calibri" w:hAnsi="Calibri" w:cs="Calibri"/>
-        </w:rPr>
-        <w:t xml:space="preserve">, </w:t>
-      </w:r>
-      <w:proofErr w:type="spellStart"/>
-      <w:r>
-        <w:rPr>
-          <w:rFonts w:ascii="Calibri" w:hAnsi="Calibri" w:cs="Calibri"/>
-        </w:rPr>
-        <w:t>zatiaľ</w:t>
-      </w:r>
-      <w:proofErr w:type="spellEnd"/>
-      <w:r>
-        <w:rPr>
-          <w:rFonts w:ascii="Calibri" w:hAnsi="Calibri" w:cs="Calibri"/>
-        </w:rPr>
-        <w:t xml:space="preserve"> </w:t>
-      </w:r>
-      <w:proofErr w:type="spellStart"/>
-      <w:r>
-        <w:rPr>
-          <w:rFonts w:ascii="Calibri" w:hAnsi="Calibri" w:cs="Calibri"/>
-        </w:rPr>
-        <w:t>čo</w:t>
-      </w:r>
-      <w:proofErr w:type="spellEnd"/>
-      <w:r>
-        <w:rPr>
-          <w:rFonts w:ascii="Calibri" w:hAnsi="Calibri" w:cs="Calibri"/>
-        </w:rPr>
-        <w:t xml:space="preserve"> Meno </w:t>
-      </w:r>
-      <w:proofErr w:type="spellStart"/>
-      <w:r>
-        <w:rPr>
-          <w:rFonts w:ascii="Calibri" w:hAnsi="Calibri" w:cs="Calibri"/>
-        </w:rPr>
-        <w:t>a</w:t>
-      </w:r>
-      <w:proofErr w:type="spellEnd"/>
-      <w:r>
-        <w:rPr>
-          <w:rFonts w:ascii="Calibri" w:hAnsi="Calibri" w:cs="Calibri"/>
-        </w:rPr>
-        <w:t xml:space="preserve"> Email </w:t>
-      </w:r>
-      <w:proofErr w:type="spellStart"/>
-      <w:r>
-        <w:rPr>
-          <w:rFonts w:ascii="Calibri" w:hAnsi="Calibri" w:cs="Calibri"/>
-        </w:rPr>
-        <w:t>používajú</w:t>
-      </w:r>
-      <w:proofErr w:type="spellEnd"/>
-      <w:r>
-        <w:rPr>
-          <w:rFonts w:ascii="Calibri" w:hAnsi="Calibri" w:cs="Calibri"/>
-        </w:rPr>
-        <w:t xml:space="preserve"> </w:t>
-      </w:r>
-      <w:proofErr w:type="spellStart"/>
-      <w:r>
-        <w:rPr>
-          <w:rFonts w:ascii="Calibri" w:hAnsi="Calibri" w:cs="Calibri"/>
-        </w:rPr>
-        <w:t>odlišné</w:t>
-      </w:r>
-      <w:proofErr w:type="spellEnd"/>
-      <w:r>
-        <w:rPr>
-          <w:rFonts w:ascii="Calibri" w:hAnsi="Calibri" w:cs="Calibri"/>
-        </w:rPr>
-        <w:t xml:space="preserve"> </w:t>
-      </w:r>
-      <w:proofErr w:type="spellStart"/>
-      <w:r>
-        <w:rPr>
-          <w:rFonts w:ascii="Calibri" w:hAnsi="Calibri" w:cs="Calibri"/>
-        </w:rPr>
-        <w:t>ohraničenie</w:t>
-      </w:r>
-      <w:proofErr w:type="spellEnd"/>
-      <w:r>
-        <w:rPr>
-          <w:rFonts w:ascii="Calibri" w:hAnsi="Calibri" w:cs="Calibri"/>
-        </w:rPr>
-        <w:t>.</w:t>
+          <w:b/>
+          <w:bCs/>
+        </w:rPr>
+        <w:t>Status:</w:t>
+      </w:r>
+      <w:r>
+        <w:rPr>
+          <w:rFonts w:ascii="Calibri" w:hAnsi="Calibri" w:cs="Calibri"/>
+        </w:rPr>
+        <w:t xml:space="preserve"> Needs verification</w:t>
       </w:r>
     </w:p>
     <w:p>
@@ -314,21 +350,16 @@
       <w:r>
         <w:rPr>
           <w:rFonts w:ascii="Calibri" w:hAnsi="Calibri" w:cs="Calibri"/>
-        </w:rPr>
-        <w:t>Status: Needs verification</w:t>
-      </w:r>
-    </w:p>
-    <w:p>
-      <w:pPr>
-        <w:rPr>
-          <w:rFonts w:ascii="Calibri" w:hAnsi="Calibri" w:cs="Calibri"/>
-        </w:rPr>
-      </w:pPr>
-      <w:r>
-        <w:rPr>
-          <w:rFonts w:ascii="Calibri" w:hAnsi="Calibri" w:cs="Calibri"/>
-        </w:rPr>
-        <w:t>Severity: Low (</w:t>
+          <w:b/>
+          <w:bCs/>
+        </w:rPr>
+        <w:t>Severity:</w:t>
+      </w:r>
+      <w:r>
+        <w:rPr>
+          <w:rFonts w:ascii="Calibri" w:hAnsi="Calibri" w:cs="Calibri"/>
+        </w:rPr>
+        <w:t xml:space="preserve"> Low (</w:t>
       </w:r>
       <w:proofErr w:type="spellStart"/>
       <w:r>
@@ -1080,6 +1111,7 @@
   <w:style w:type="character" w:default="1" w:styleId="DefaultParagraphFont">
     <w:name w:val="Default Paragraph Font"/>
     <w:uiPriority w:val="1"/>
+    <w:semiHidden/>
     <w:unhideWhenUsed/>
   </w:style>
   <w:style w:type="table" w:default="1" w:styleId="TableNormal">

</xml_diff>